<commit_message>
Fix hover-only contrast found by axe DevTools; add a hover sweep to the audit
The team's axe DevTools user-flow scan (export saved under
docs/accessibility/axe-devtools/) was taken against the pre-fix build:
20 of its 21 issues were already fixed on this branch. The 21st was new:
hovering the selected option of a segmented choice replaced its dark fill
with the pale hover fill under white text (1.09:1).

- Hover fill applies only to unselected segmented options.
- a11y-audit.mjs hovers every control on every screen and measures the
  text inside, blending translucent fills. With the old CSS it reports the
  segmented bug and a second one: the sidebar "3 alerts" yellow fell to
  4.17:1 over the hover tint. Alerts yellow is now #ffec99 (5.01:1 hovered).
- Report, checklist, conformance and VPAT updated (16 defects fixed).

Co-Authored-By: Claude Opus 5.5 <noreply@anthropic.com>
</commit_message>
<xml_diff>
--- a/docs/accessibility/vpat/CareConnect-Desktop-VPAT.docx
+++ b/docs/accessibility/vpat/CareConnect-Desktop-VPAT.docx
@@ -539,7 +539,25 @@
                 <w:sz w:val="20"/>
                 <w:szCs w:val="20"/>
               </w:rPr>
-              <w:t xml:space="preserve">Automated testing: axe-core 4.14 (the engine inside axe DevTools) run in Chromium against the renderer on the Vite dev server, rule sets wcag2a, wcag2aa, wcag21a, wcag21aa and best-practice plus the label-in-name rule, on 14 screens and states at two window sizes (28 scans). Every “needs review” contrast result was measured separately (157 measurements). Script: desktop/scripts/a11y-audit.mjs.</w:t>
+              <w:t xml:space="preserve">Automated testing: axe-core 4.14 (the engine inside axe DevTools) run in Chromium against the renderer on the Vite dev server, rule sets wcag2a, wcag2aa, wcag21a, wcag21aa and best-practice plus the label-in-name rule, on 14 screens and states at two window sizes (28 scans). Every “needs review” contrast result was measured separately (149 measurements), and every control was measured again with the pointer over it. Script: desktop/scripts/a11y-audit.mjs.</w:t>
+            </w:r>
+          </w:p>
+          <w:p>
+            <w:pPr>
+              <w:pStyle w:val="ListParagraph"/>
+              <w:numPr>
+                <w:ilvl w:val="0"/>
+                <w:numId w:val="2"/>
+              </w:numPr>
+              <w:spacing w:after="60"/>
+            </w:pPr>
+            <w:r>
+              <w:rPr>
+                <w:rFonts w:ascii="Arial" w:cs="Arial" w:eastAsia="Arial" w:hAnsi="Arial"/>
+                <w:sz w:val="20"/>
+                <w:szCs w:val="20"/>
+              </w:rPr>
+              <w:t xml:space="preserve">axe DevTools browser extension 4.138 (axe-core 4.13, WCAG 2.1 AA) user-flow scan. Its 21 issues were all resolved; one, a hover-only contrast failure, was new and led to the hover check above.</w:t>
             </w:r>
           </w:p>
           <w:p>
@@ -5234,7 +5252,7 @@
                 <w:sz w:val="20"/>
                 <w:szCs w:val="20"/>
               </w:rPr>
-              <w:t xml:space="preserve">All text meets 4.5:1 (3:1 for large text). Three failures were fixed: the sidebar alerts label (3.98:1, now 5.96:1), the medication badge (2.01:1, now 9.75:1) and completed My Day tasks, which were faded with opacity. All 157 contrast results axe could not decide were measured and pass.</w:t>
+              <w:t xml:space="preserve">All text meets 4.5:1 (3:1 for large text). Three failures were fixed: the sidebar alerts label (3.98:1, now 7.17:1), the medication badge (2.01:1, now 9.75:1) and completed My Day tasks, which were faded with opacity. Two hover-only failures were also fixed: the selected caption size or colour option turned white on pale blue (1.09:1) under the pointer, and the alerts label fell to 4.17:1 over the hover tint (now #ffec99, 5.01:1). All 149 contrast results axe could not decide, and every control in its hovered state, were measured and pass.</w:t>
             </w:r>
           </w:p>
         </w:tc>

</xml_diff>